<commit_message>
2026-05-02T08:03:00 				Genesis 41:6, Genesis 41:23, Genesis 41:27 				1996-02-14 Electronic Data Systems (EDS)/Westpac contract ended. 				1996-02-14...2026-05-02T08:03:00=11035 days (30 biblical years, 7 biblical months, 25 days) (30 years, 2 months, 2 weeks, 4 days)
</commit_message>
<xml_diff>
--- a/IIS/WordEngineering/Resume/KenAdenijiResume.docx
+++ b/IIS/WordEngineering/Resume/KenAdenijiResume.docx
@@ -1061,7 +1061,7 @@
       </w:r>
     </w:p>
     <w:bookmarkEnd w:id="56"/>
-    <w:bookmarkStart w:id="58" w:name="Xe621a272b2e3ebd65efd913dd20c1c43d7c3de8"/>
+    <w:bookmarkStart w:id="58" w:name="Xcb285883aa25839e9efa32b4912083424db33f9"/>
     <w:p>
       <w:pPr>
         <w:pStyle w:val="Heading3"/>
@@ -1095,7 +1095,7 @@
         <w:t xml:space="preserve"> </w:t>
       </w:r>
       <w:r>
-        <w:t xml:space="preserve">Contract Consultant (October 1995 to February 1996)</w:t>
+        <w:t xml:space="preserve">Contract Consultant (October 1995 to 1996-02-14)</w:t>
       </w:r>
     </w:p>
     <w:p>

</xml_diff>